<commit_message>
Update contact info in mail and proposal doc (Shibahara Yuki)
Co-Authored-By: Claude Sonnet 4.6 <noreply@anthropic.com>
</commit_message>
<xml_diff>
--- a/SafeDrug_行政提案書.docx
+++ b/SafeDrug_行政提案書.docx
@@ -178,7 +178,9 @@
                 <w:b w:val="0"/>
                 <w:sz w:val="20"/>
               </w:rPr>
-              <w:t>福岡県在住　個人</w:t>
+            </w:r>
+            <w:r>
+              <w:t>柴原 悠気（福岡県在住）</w:t>
             </w:r>
           </w:p>
         </w:tc>
@@ -3015,6 +3017,8 @@
           <w:b w:val="0"/>
           <w:sz w:val="21"/>
         </w:rPr>
+      </w:r>
+      <w:r>
         <w:t>提案者メールアドレス：ace.cva1113@gmail.com</w:t>
       </w:r>
     </w:p>
@@ -3028,6 +3032,13 @@
           <w:b w:val="0"/>
           <w:sz w:val="21"/>
         </w:rPr>
+      </w:r>
+      <w:r>
+        <w:t>提案者電話番号：070-1945-5207</w:t>
+      </w:r>
+    </w:p>
+    <w:p>
+      <w:r>
         <w:t>デモURL：https://yuuki0248.github.io/safedrug/</w:t>
       </w:r>
     </w:p>

</xml_diff>

<commit_message>
Add section 2.4 (staff management screen) to 行政提案書
Added section 2.4 'アプリ未使用者への対応（店員用管理画面）' to
第2章 of SafeDrug_行政提案書.docx, covering:
- 2.4.1 手動購入記録（7項目のフォーム説明）
- 2.4.2 身分証確認の記録（警戒マーク・赤ハイライト）
- 2.4.3 CSVエクスポートによるデータ蓄積
- 2.4.4 店員用管理画面へのアクセス（PIN認証・staff.html URL）

Co-Authored-By: Claude Sonnet 4.6 <noreply@anthropic.com>
</commit_message>
<xml_diff>
--- a/SafeDrug_行政提案書.docx
+++ b/SafeDrug_行政提案書.docx
@@ -1114,6 +1114,305 @@
     </w:p>
     <w:p>
       <w:pPr>
+        <w:spacing w:before="280" w:after="100"/>
+      </w:pPr>
+      <w:r>
+        <w:rPr>
+          <w:rFonts w:ascii="MS Mincho" w:hAnsi="MS Mincho" w:eastAsia="MS Mincho"/>
+          <w:b/>
+          <w:sz w:val="23"/>
+          <w:szCs w:val="23"/>
+          <w:color w:val="1E4080"/>
+        </w:rPr>
+        <w:t xml:space="preserve">2.4　アプリ未使用者への対応（店員用管理画面）</w:t>
+      </w:r>
+    </w:p>
+    <w:p>
+      <w:pPr>
+        <w:spacing w:before="60" w:after="60"/>
+      </w:pPr>
+      <w:r>
+        <w:rPr>
+          <w:rFonts w:ascii="MS Mincho" w:hAnsi="MS Mincho" w:eastAsia="MS Mincho"/>
+          <w:sz w:val="21"/>
+          <w:szCs w:val="21"/>
+        </w:rPr>
+        <w:t xml:space="preserve">SafeDrugでは、スマートフォンを所持しない購入者やアプリの使用を拒否する購入者に対して、店員が代替対応を行うための専用管理画面「staff.html」を提供します。店員専用画面は 4 桁の PIN コード認証で保護され、一般利用者との分離が担保されています。</w:t>
+      </w:r>
+    </w:p>
+    <w:p>
+      <w:pPr>
+        <w:spacing w:before="200" w:after="80"/>
+      </w:pPr>
+      <w:r>
+        <w:rPr>
+          <w:rFonts w:ascii="MS Mincho" w:hAnsi="MS Mincho" w:eastAsia="MS Mincho"/>
+          <w:b/>
+          <w:sz w:val="21"/>
+          <w:szCs w:val="21"/>
+          <w:color w:val="1E4080"/>
+        </w:rPr>
+        <w:t xml:space="preserve">2.4.1　手動購入記録</w:t>
+      </w:r>
+    </w:p>
+    <w:p>
+      <w:pPr>
+        <w:spacing w:before="60" w:after="60"/>
+      </w:pPr>
+      <w:r>
+        <w:rPr>
+          <w:rFonts w:ascii="MS Mincho" w:hAnsi="MS Mincho" w:eastAsia="MS Mincho"/>
+          <w:sz w:val="21"/>
+          <w:szCs w:val="21"/>
+        </w:rPr>
+        <w:t xml:space="preserve">アプリ確認を実施できなかった購入者の情報を、店員が手動で記録します。記録項目は以下の通りです。</w:t>
+      </w:r>
+    </w:p>
+    <w:p>
+      <w:pPr>
+        <w:pStyle w:val="ListBullet"/>
+        <w:spacing w:before="60" w:after="60"/>
+      </w:pPr>
+      <w:r>
+        <w:rPr>
+          <w:rFonts w:ascii="MS Mincho" w:hAnsi="MS Mincho" w:eastAsia="MS Mincho"/>
+          <w:sz w:val="21"/>
+          <w:szCs w:val="21"/>
+        </w:rPr>
+        <w:t xml:space="preserve">購入日時（自動入力）</w:t>
+      </w:r>
+    </w:p>
+    <w:p>
+      <w:pPr>
+        <w:pStyle w:val="ListBullet"/>
+        <w:spacing w:before="60" w:after="60"/>
+      </w:pPr>
+      <w:r>
+        <w:rPr>
+          <w:rFonts w:ascii="MS Mincho" w:hAnsi="MS Mincho" w:eastAsia="MS Mincho"/>
+          <w:sz w:val="21"/>
+          <w:szCs w:val="21"/>
+        </w:rPr>
+        <w:t xml:space="preserve">店舗名（選択式）</w:t>
+      </w:r>
+    </w:p>
+    <w:p>
+      <w:pPr>
+        <w:pStyle w:val="ListBullet"/>
+        <w:spacing w:before="60" w:after="60"/>
+      </w:pPr>
+      <w:r>
+        <w:rPr>
+          <w:rFonts w:ascii="MS Mincho" w:hAnsi="MS Mincho" w:eastAsia="MS Mincho"/>
+          <w:sz w:val="21"/>
+          <w:szCs w:val="21"/>
+        </w:rPr>
+        <w:t xml:space="preserve">購入商品カテゴリ（コデイン含有薬・デキストロメトルファン含有薬・ジフェンヒドラミン含有薬）</w:t>
+      </w:r>
+    </w:p>
+    <w:p>
+      <w:pPr>
+        <w:pStyle w:val="ListBullet"/>
+        <w:spacing w:before="60" w:after="60"/>
+      </w:pPr>
+      <w:r>
+        <w:rPr>
+          <w:rFonts w:ascii="MS Mincho" w:hAnsi="MS Mincho" w:eastAsia="MS Mincho"/>
+          <w:sz w:val="21"/>
+          <w:szCs w:val="21"/>
+        </w:rPr>
+        <w:t xml:space="preserve">購入者の電話番号（任意）</w:t>
+      </w:r>
+    </w:p>
+    <w:p>
+      <w:pPr>
+        <w:pStyle w:val="ListBullet"/>
+        <w:spacing w:before="60" w:after="60"/>
+      </w:pPr>
+      <w:r>
+        <w:rPr>
+          <w:rFonts w:ascii="MS Mincho" w:hAnsi="MS Mincho" w:eastAsia="MS Mincho"/>
+          <w:sz w:val="21"/>
+          <w:szCs w:val="21"/>
+        </w:rPr>
+        <w:t xml:space="preserve">アプリ確認の状況（確認済み／拒否／スマホなし申告／未成年）</w:t>
+      </w:r>
+    </w:p>
+    <w:p>
+      <w:pPr>
+        <w:pStyle w:val="ListBullet"/>
+        <w:spacing w:before="60" w:after="60"/>
+      </w:pPr>
+      <w:r>
+        <w:rPr>
+          <w:rFonts w:ascii="MS Mincho" w:hAnsi="MS Mincho" w:eastAsia="MS Mincho"/>
+          <w:sz w:val="21"/>
+          <w:szCs w:val="21"/>
+        </w:rPr>
+        <w:t xml:space="preserve">身分証確認の状況（確認済み／未確認／提示拒否）</w:t>
+      </w:r>
+    </w:p>
+    <w:p>
+      <w:pPr>
+        <w:pStyle w:val="ListBullet"/>
+        <w:spacing w:before="60" w:after="60"/>
+      </w:pPr>
+      <w:r>
+        <w:rPr>
+          <w:rFonts w:ascii="MS Mincho" w:hAnsi="MS Mincho" w:eastAsia="MS Mincho"/>
+          <w:sz w:val="21"/>
+          <w:szCs w:val="21"/>
+        </w:rPr>
+        <w:t xml:space="preserve">特記事項（フリーテキスト）</w:t>
+      </w:r>
+    </w:p>
+    <w:p>
+      <w:pPr>
+        <w:spacing w:before="200" w:after="80"/>
+      </w:pPr>
+      <w:r>
+        <w:rPr>
+          <w:rFonts w:ascii="MS Mincho" w:hAnsi="MS Mincho" w:eastAsia="MS Mincho"/>
+          <w:b/>
+          <w:sz w:val="21"/>
+          <w:szCs w:val="21"/>
+          <w:color w:val="1E4080"/>
+        </w:rPr>
+        <w:t xml:space="preserve">2.4.2　身分証確認の記録</w:t>
+      </w:r>
+    </w:p>
+    <w:p>
+      <w:pPr>
+        <w:spacing w:before="60" w:after="60"/>
+      </w:pPr>
+      <w:r>
+        <w:rPr>
+          <w:rFonts w:ascii="MS Mincho" w:hAnsi="MS Mincho" w:eastAsia="MS Mincho"/>
+          <w:sz w:val="21"/>
+          <w:szCs w:val="21"/>
+        </w:rPr>
+        <w:t xml:space="preserve">アプリに代わる本人確認として、身分証提示の有無とその結果を記録します。提示を拒否した購入者は記録上で「警戒マーク」が付与され、一覧画面で赤色にハイライト表示されます。アプリ拒否・身分証拒否の件数は集計カードにリアルタイム表示され、店舗の管理者が現場状況を即座に把握できます。</w:t>
+      </w:r>
+    </w:p>
+    <w:p>
+      <w:pPr>
+        <w:spacing w:before="200" w:after="80"/>
+      </w:pPr>
+      <w:r>
+        <w:rPr>
+          <w:rFonts w:ascii="MS Mincho" w:hAnsi="MS Mincho" w:eastAsia="MS Mincho"/>
+          <w:b/>
+          <w:sz w:val="21"/>
+          <w:szCs w:val="21"/>
+          <w:color w:val="1E4080"/>
+        </w:rPr>
+        <w:t xml:space="preserve">2.4.3　CSV エクスポートによるデータ蓄積</w:t>
+      </w:r>
+    </w:p>
+    <w:p>
+      <w:pPr>
+        <w:spacing w:before="60" w:after="60"/>
+      </w:pPr>
+      <w:r>
+        <w:rPr>
+          <w:rFonts w:ascii="MS Mincho" w:hAnsi="MS Mincho" w:eastAsia="MS Mincho"/>
+          <w:sz w:val="21"/>
+          <w:szCs w:val="21"/>
+        </w:rPr>
+        <w:t xml:space="preserve">記録した購入情報は CSV 形式でエクスポート可能です。行政・薬事機関が分析することで、アプリ非利用層における購入傾向の把握と、地域・店舗横断の実態調査が可能となります。エクスポート項目は以下の通りです。</w:t>
+      </w:r>
+    </w:p>
+    <w:p>
+      <w:pPr>
+        <w:pStyle w:val="ListBullet"/>
+        <w:spacing w:before="60" w:after="60"/>
+      </w:pPr>
+      <w:r>
+        <w:rPr>
+          <w:rFonts w:ascii="MS Mincho" w:hAnsi="MS Mincho" w:eastAsia="MS Mincho"/>
+          <w:sz w:val="21"/>
+          <w:szCs w:val="21"/>
+        </w:rPr>
+        <w:t xml:space="preserve">日時・店舗名・商品カテゴリ・購入者電話番号</w:t>
+      </w:r>
+    </w:p>
+    <w:p>
+      <w:pPr>
+        <w:pStyle w:val="ListBullet"/>
+        <w:spacing w:before="60" w:after="60"/>
+      </w:pPr>
+      <w:r>
+        <w:rPr>
+          <w:rFonts w:ascii="MS Mincho" w:hAnsi="MS Mincho" w:eastAsia="MS Mincho"/>
+          <w:sz w:val="21"/>
+          <w:szCs w:val="21"/>
+        </w:rPr>
+        <w:t xml:space="preserve">アプリ確認状況・身分証確認状況</w:t>
+      </w:r>
+    </w:p>
+    <w:p>
+      <w:pPr>
+        <w:pStyle w:val="ListBullet"/>
+        <w:spacing w:before="60" w:after="60"/>
+      </w:pPr>
+      <w:r>
+        <w:rPr>
+          <w:rFonts w:ascii="MS Mincho" w:hAnsi="MS Mincho" w:eastAsia="MS Mincho"/>
+          <w:sz w:val="21"/>
+          <w:szCs w:val="21"/>
+        </w:rPr>
+        <w:t xml:space="preserve">特記事項・警戒フラグ（要警戒／通常）</w:t>
+      </w:r>
+    </w:p>
+    <w:p>
+      <w:pPr>
+        <w:spacing w:before="200" w:after="80"/>
+      </w:pPr>
+      <w:r>
+        <w:rPr>
+          <w:rFonts w:ascii="MS Mincho" w:hAnsi="MS Mincho" w:eastAsia="MS Mincho"/>
+          <w:b/>
+          <w:sz w:val="21"/>
+          <w:szCs w:val="21"/>
+          <w:color w:val="1E4080"/>
+        </w:rPr>
+        <w:t xml:space="preserve">2.4.4　店員用管理画面へのアクセス</w:t>
+      </w:r>
+    </w:p>
+    <w:p>
+      <w:pPr>
+        <w:spacing w:before="60" w:after="60"/>
+      </w:pPr>
+      <w:r>
+        <w:rPr>
+          <w:rFonts w:ascii="MS Mincho" w:hAnsi="MS Mincho" w:eastAsia="MS Mincho"/>
+          <w:sz w:val="21"/>
+          <w:szCs w:val="21"/>
+        </w:rPr>
+        <w:t xml:space="preserve">店員用管理画面へのアクセスには 4 桁の PIN コード認証が必要であり、一般利用者との分離が担保されています。本番環境では店舗システムとの連携認証に置き換えることを想定しています。</w:t>
+      </w:r>
+    </w:p>
+    <w:p>
+      <w:pPr>
+        <w:spacing w:before="60" w:after="60"/>
+      </w:pPr>
+      <w:r>
+        <w:rPr>
+          <w:rFonts w:ascii="MS Mincho" w:hAnsi="MS Mincho" w:eastAsia="MS Mincho"/>
+          <w:sz w:val="21"/>
+          <w:szCs w:val="21"/>
+          <w:color w:val="0070C0"/>
+        </w:rPr>
+        <w:t xml:space="preserve">アクセス先 URL：https://yuuki0248.github.io/safedrug/staff.html</w:t>
+      </w:r>
+    </w:p>
+    <w:p>
+      <w:pPr>
+        <w:spacing w:before="80" w:after="80"/>
+      </w:pPr>
+    </w:p>
+    <w:p>
+      <w:pPr>
         <w:spacing w:before="360" w:after="120"/>
         <w:jc w:val="left"/>
         <w:pBdr>

</xml_diff>